<commit_message>
added work for tuesday into week 5 logbooks
</commit_message>
<xml_diff>
--- a/Weekly Logs/Matt/Matt Baker - Week 5 Individual Logbook.docx
+++ b/Weekly Logs/Matt/Matt Baker - Week 5 Individual Logbook.docx
@@ -913,7 +913,7 @@
           <w:r>
             <w:fldChar w:fldCharType="separate"/>
           </w:r>
-          <w:hyperlink w:anchor="_Toc237261073" w:history="1">
+          <w:hyperlink w:anchor="_Toc237345715" w:history="1">
             <w:r>
               <w:rPr>
                 <w:rStyle w:val="Hyperlink"/>
@@ -940,7 +940,7 @@
                 <w:noProof/>
                 <w:webHidden/>
               </w:rPr>
-              <w:instrText xml:space="preserve"> PAGEREF _Toc237261073 \h </w:instrText>
+              <w:instrText xml:space="preserve"> PAGEREF _Toc237345715 \h </w:instrText>
             </w:r>
             <w:r>
               <w:rPr>
@@ -984,7 +984,7 @@
               <w:sz w:val="24"/>
             </w:rPr>
           </w:pPr>
-          <w:hyperlink w:anchor="_Toc237261074" w:history="1">
+          <w:hyperlink w:anchor="_Toc237345716" w:history="1">
             <w:r>
               <w:rPr>
                 <w:rStyle w:val="Hyperlink"/>
@@ -1011,7 +1011,7 @@
                 <w:noProof/>
                 <w:webHidden/>
               </w:rPr>
-              <w:instrText xml:space="preserve"> PAGEREF _Toc237261074 \h </w:instrText>
+              <w:instrText xml:space="preserve"> PAGEREF _Toc237345716 \h </w:instrText>
             </w:r>
             <w:r>
               <w:rPr>
@@ -1055,7 +1055,7 @@
               <w:sz w:val="24"/>
             </w:rPr>
           </w:pPr>
-          <w:hyperlink w:anchor="_Toc237261075" w:history="1">
+          <w:hyperlink w:anchor="_Toc237345717" w:history="1">
             <w:r>
               <w:rPr>
                 <w:rStyle w:val="Hyperlink"/>
@@ -1082,7 +1082,7 @@
                 <w:noProof/>
                 <w:webHidden/>
               </w:rPr>
-              <w:instrText xml:space="preserve"> PAGEREF _Toc237261075 \h </w:instrText>
+              <w:instrText xml:space="preserve"> PAGEREF _Toc237345717 \h </w:instrText>
             </w:r>
             <w:r>
               <w:rPr>
@@ -1126,7 +1126,7 @@
               <w:sz w:val="24"/>
             </w:rPr>
           </w:pPr>
-          <w:hyperlink w:anchor="_Toc237261076" w:history="1">
+          <w:hyperlink w:anchor="_Toc237345718" w:history="1">
             <w:r>
               <w:rPr>
                 <w:rStyle w:val="Hyperlink"/>
@@ -1153,7 +1153,7 @@
                 <w:noProof/>
                 <w:webHidden/>
               </w:rPr>
-              <w:instrText xml:space="preserve"> PAGEREF _Toc237261076 \h </w:instrText>
+              <w:instrText xml:space="preserve"> PAGEREF _Toc237345718 \h </w:instrText>
             </w:r>
             <w:r>
               <w:rPr>
@@ -1197,7 +1197,7 @@
               <w:sz w:val="24"/>
             </w:rPr>
           </w:pPr>
-          <w:hyperlink w:anchor="_Toc237261077" w:history="1">
+          <w:hyperlink w:anchor="_Toc237345719" w:history="1">
             <w:r>
               <w:rPr>
                 <w:rStyle w:val="Hyperlink"/>
@@ -1224,7 +1224,7 @@
                 <w:noProof/>
                 <w:webHidden/>
               </w:rPr>
-              <w:instrText xml:space="preserve"> PAGEREF _Toc237261077 \h </w:instrText>
+              <w:instrText xml:space="preserve"> PAGEREF _Toc237345719 \h </w:instrText>
             </w:r>
             <w:r>
               <w:rPr>
@@ -1268,7 +1268,7 @@
               <w:sz w:val="24"/>
             </w:rPr>
           </w:pPr>
-          <w:hyperlink w:anchor="_Toc237261078" w:history="1">
+          <w:hyperlink w:anchor="_Toc237345720" w:history="1">
             <w:r>
               <w:rPr>
                 <w:rStyle w:val="Hyperlink"/>
@@ -1295,7 +1295,7 @@
                 <w:noProof/>
                 <w:webHidden/>
               </w:rPr>
-              <w:instrText xml:space="preserve"> PAGEREF _Toc237261078 \h </w:instrText>
+              <w:instrText xml:space="preserve"> PAGEREF _Toc237345720 \h </w:instrText>
             </w:r>
             <w:r>
               <w:rPr>
@@ -1339,12 +1339,83 @@
               <w:sz w:val="24"/>
             </w:rPr>
           </w:pPr>
-          <w:hyperlink w:anchor="_Toc237261079" w:history="1">
+          <w:hyperlink w:anchor="_Toc237345721" w:history="1">
             <w:r>
               <w:rPr>
                 <w:rStyle w:val="Hyperlink"/>
                 <w:noProof/>
               </w:rPr>
+              <w:t>Testing</w:t>
+            </w:r>
+            <w:r>
+              <w:rPr>
+                <w:noProof/>
+                <w:webHidden/>
+              </w:rPr>
+              <w:tab/>
+            </w:r>
+            <w:r>
+              <w:rPr>
+                <w:noProof/>
+                <w:webHidden/>
+              </w:rPr>
+              <w:fldChar w:fldCharType="begin"/>
+            </w:r>
+            <w:r>
+              <w:rPr>
+                <w:noProof/>
+                <w:webHidden/>
+              </w:rPr>
+              <w:instrText xml:space="preserve"> PAGEREF _Toc237345721 \h </w:instrText>
+            </w:r>
+            <w:r>
+              <w:rPr>
+                <w:noProof/>
+                <w:webHidden/>
+              </w:rPr>
+            </w:r>
+            <w:r>
+              <w:rPr>
+                <w:noProof/>
+                <w:webHidden/>
+              </w:rPr>
+              <w:fldChar w:fldCharType="separate"/>
+            </w:r>
+            <w:r>
+              <w:rPr>
+                <w:noProof/>
+                <w:webHidden/>
+              </w:rPr>
+              <w:t>4</w:t>
+            </w:r>
+            <w:r>
+              <w:rPr>
+                <w:noProof/>
+                <w:webHidden/>
+              </w:rPr>
+              <w:fldChar w:fldCharType="end"/>
+            </w:r>
+          </w:hyperlink>
+        </w:p>
+        <w:p>
+          <w:pPr>
+            <w:pStyle w:val="TOC2"/>
+            <w:tabs>
+              <w:tab w:val="right" w:leader="dot" w:pos="9013"/>
+            </w:tabs>
+            <w:rPr>
+              <w:rFonts w:asciiTheme="minorHAnsi" w:eastAsiaTheme="minorEastAsia" w:hAnsiTheme="minorHAnsi" w:cstheme="minorBidi"/>
+              <w:noProof/>
+              <w:color w:val="auto"/>
+              <w:sz w:val="24"/>
+            </w:rPr>
+          </w:pPr>
+          <w:hyperlink w:anchor="_Toc237345722" w:history="1">
+            <w:r>
+              <w:rPr>
+                <w:rStyle w:val="Hyperlink"/>
+                <w:noProof/>
+              </w:rPr>
               <w:t>Development</w:t>
             </w:r>
             <w:r>
@@ -1366,7 +1437,7 @@
                 <w:noProof/>
                 <w:webHidden/>
               </w:rPr>
-              <w:instrText xml:space="preserve"> PAGEREF _Toc237261079 \h </w:instrText>
+              <w:instrText xml:space="preserve"> PAGEREF _Toc237345722 \h </w:instrText>
             </w:r>
             <w:r>
               <w:rPr>
@@ -1386,7 +1457,7 @@
                 <w:noProof/>
                 <w:webHidden/>
               </w:rPr>
-              <w:t>3</w:t>
+              <w:t>4</w:t>
             </w:r>
             <w:r>
               <w:rPr>
@@ -1604,6 +1675,7 @@
         <w:ind w:left="5" w:firstLine="0"/>
       </w:pPr>
       <w:r>
+        <w:lastRenderedPageBreak/>
         <w:t xml:space="preserve"> </w:t>
       </w:r>
     </w:p>
@@ -1612,9 +1684,8 @@
         <w:pStyle w:val="Heading1"/>
         <w:ind w:left="-5"/>
       </w:pPr>
-      <w:bookmarkStart w:id="0" w:name="_Toc237261073"/>
-      <w:r>
-        <w:lastRenderedPageBreak/>
+      <w:bookmarkStart w:id="0" w:name="_Toc237345715"/>
+      <w:r>
         <w:t>Hours Breakdown</w:t>
       </w:r>
       <w:bookmarkEnd w:id="0"/>
@@ -2421,7 +2492,7 @@
         <w:pStyle w:val="Heading1"/>
         <w:ind w:left="-5"/>
       </w:pPr>
-      <w:bookmarkStart w:id="1" w:name="_Toc237261074"/>
+      <w:bookmarkStart w:id="1" w:name="_Toc237345716"/>
       <w:r>
         <w:lastRenderedPageBreak/>
         <w:t>Completed Content/Documentation</w:t>
@@ -2433,7 +2504,7 @@
       <w:pPr>
         <w:pStyle w:val="Heading2"/>
       </w:pPr>
-      <w:bookmarkStart w:id="2" w:name="_Toc237261075"/>
+      <w:bookmarkStart w:id="2" w:name="_Toc237345717"/>
       <w:r>
         <w:t>Team Meeting</w:t>
       </w:r>
@@ -2443,10 +2514,28 @@
       <w:bookmarkEnd w:id="2"/>
     </w:p>
     <w:p>
+      <w:r>
+        <w:t>Tuesday, August 11</w:t>
+      </w:r>
+    </w:p>
+    <w:p>
+      <w:r>
+        <w:t>11-12:30pm (1hr 30 mins)</w:t>
+      </w:r>
+    </w:p>
+    <w:p>
+      <w:r>
+        <w:t>Lots of auditing, working out the agenda for the week, what Sam and Dave can work on, how to find hours</w:t>
+      </w:r>
+      <w:r>
+        <w:t>, delegating work, a tool for each of us to fiddle with.</w:t>
+      </w:r>
+    </w:p>
+    <w:p>
       <w:pPr>
         <w:pStyle w:val="Heading2"/>
       </w:pPr>
-      <w:bookmarkStart w:id="3" w:name="_Toc237261076"/>
+      <w:bookmarkStart w:id="3" w:name="_Toc237345718"/>
       <w:r>
         <w:t>Advisor Meetings</w:t>
       </w:r>
@@ -2456,7 +2545,7 @@
       <w:pPr>
         <w:pStyle w:val="Heading2"/>
       </w:pPr>
-      <w:bookmarkStart w:id="4" w:name="_Toc237261077"/>
+      <w:bookmarkStart w:id="4" w:name="_Toc237345719"/>
       <w:r>
         <w:t>Client Meetings</w:t>
       </w:r>
@@ -2466,19 +2555,40 @@
       <w:pPr>
         <w:pStyle w:val="Heading2"/>
       </w:pPr>
-      <w:bookmarkStart w:id="5" w:name="_Toc237261078"/>
+      <w:bookmarkStart w:id="5" w:name="_Toc237345720"/>
       <w:r>
         <w:t>Research</w:t>
       </w:r>
       <w:bookmarkEnd w:id="5"/>
     </w:p>
+    <w:p/>
+    <w:p/>
+    <w:p/>
+    <w:p/>
+    <w:p/>
+    <w:p/>
+    <w:p/>
+    <w:p/>
+    <w:p/>
+    <w:p/>
+    <w:p/>
+    <w:p/>
+    <w:p/>
+    <w:p/>
+    <w:p/>
+    <w:p/>
+    <w:p/>
+    <w:p/>
+    <w:p/>
+    <w:p/>
     <w:p>
       <w:pPr>
         <w:pStyle w:val="Heading2"/>
       </w:pPr>
-      <w:bookmarkStart w:id="6" w:name="_Toc237261079"/>
-      <w:r>
-        <w:t>Development</w:t>
+      <w:bookmarkStart w:id="6" w:name="_Toc237345721"/>
+      <w:r>
+        <w:lastRenderedPageBreak/>
+        <w:t>Testing</w:t>
       </w:r>
       <w:bookmarkEnd w:id="6"/>
     </w:p>
@@ -2494,56 +2604,49 @@
     </w:p>
     <w:p>
       <w:r>
-        <w:t>Setting up a kali</w:t>
-      </w:r>
-      <w:r>
-        <w:t xml:space="preserve"> VM</w:t>
-      </w:r>
-      <w:r>
-        <w:t xml:space="preserve"> install on my own home PC for local testing, tools practice, and </w:t>
-      </w:r>
-      <w:r>
-        <w:t>as a contingency if for whatever reason we are not able to work on our dedicated PC at school. This will also mean that we can conduct investigations in parallel with each other if access to our AI PC is contested.</w:t>
-      </w:r>
-    </w:p>
-    <w:p>
-      <w:r>
-        <w:t>2:00-</w:t>
-      </w:r>
-      <w:r>
-        <w:t>4</w:t>
-      </w:r>
-      <w:r>
-        <w:t xml:space="preserve"> (</w:t>
-      </w:r>
-      <w:r>
-        <w:t>2hours</w:t>
-      </w:r>
-      <w:r>
-        <w:t>)</w:t>
-      </w:r>
-    </w:p>
-    <w:p>
-      <w:r>
-        <w:t xml:space="preserve">Doing some </w:t>
-      </w:r>
-      <w:r>
-        <w:t>refamiliarization</w:t>
-      </w:r>
-      <w:r>
-        <w:t xml:space="preserve"> with exiftool on files</w:t>
-      </w:r>
-      <w:r>
-        <w:t>, testing different types of photos/screenshots to pull gps data from my own phone</w:t>
-      </w:r>
-      <w:r>
-        <w:t>, even if I try to dox myself by attaching the location to an image, exiftool will generate the field, but the data will be missing (</w:t>
-      </w:r>
-      <w:r>
-        <w:t>export process strips metadata</w:t>
-      </w:r>
-      <w:r>
-        <w:t>?).</w:t>
+        <w:t xml:space="preserve">Setting up a kali VM install on my own home PC for local testing, tools practice, and as a contingency if for whatever reason we </w:t>
+      </w:r>
+      <w:proofErr w:type="gramStart"/>
+      <w:r>
+        <w:t>are not able to</w:t>
+      </w:r>
+      <w:proofErr w:type="gramEnd"/>
+      <w:r>
+        <w:t xml:space="preserve"> work on our dedicated PC at school. This will also mean that we can conduct investigations in parallel with each other if access to our AI PC is contested.</w:t>
+      </w:r>
+    </w:p>
+    <w:p>
+      <w:r>
+        <w:t>2:00-4 (2hours)</w:t>
+      </w:r>
+    </w:p>
+    <w:p>
+      <w:r>
+        <w:t xml:space="preserve">Doing some refamiliarization with </w:t>
+      </w:r>
+      <w:proofErr w:type="spellStart"/>
+      <w:r>
+        <w:t>exiftool</w:t>
+      </w:r>
+      <w:proofErr w:type="spellEnd"/>
+      <w:r>
+        <w:t xml:space="preserve"> on files, testing different types of photos/screenshots to pull </w:t>
+      </w:r>
+      <w:proofErr w:type="spellStart"/>
+      <w:r>
+        <w:t>gps</w:t>
+      </w:r>
+      <w:proofErr w:type="spellEnd"/>
+      <w:r>
+        <w:t xml:space="preserve"> data from my own phone, even if I try to dox myself by attaching the location to an image, </w:t>
+      </w:r>
+      <w:proofErr w:type="spellStart"/>
+      <w:r>
+        <w:t>exiftool</w:t>
+      </w:r>
+      <w:proofErr w:type="spellEnd"/>
+      <w:r>
+        <w:t xml:space="preserve"> will generate the field, but the data will be missing (export process strips metadata?).</w:t>
       </w:r>
     </w:p>
     <w:p>
@@ -2552,7 +2655,7 @@
           <w:noProof/>
         </w:rPr>
         <w:drawing>
-          <wp:inline distT="0" distB="0" distL="0" distR="0" wp14:anchorId="050989D2" wp14:editId="549460B0">
+          <wp:inline distT="0" distB="0" distL="0" distR="0" wp14:anchorId="7195FF07" wp14:editId="22659586">
             <wp:extent cx="4660710" cy="1873478"/>
             <wp:effectExtent l="0" t="0" r="6985" b="0"/>
             <wp:docPr id="311307909" name="Picture 1"/>
@@ -2620,7 +2723,7 @@
           <w:noProof/>
         </w:rPr>
         <w:drawing>
-          <wp:inline distT="0" distB="0" distL="0" distR="0" wp14:anchorId="493E39C0" wp14:editId="30F708E9">
+          <wp:inline distT="0" distB="0" distL="0" distR="0" wp14:anchorId="2E25F166" wp14:editId="00AAA6FB">
             <wp:extent cx="4681182" cy="1872369"/>
             <wp:effectExtent l="0" t="0" r="5715" b="0"/>
             <wp:docPr id="1275717212" name="Picture 1"/>
@@ -2656,11 +2759,222 @@
         </w:drawing>
       </w:r>
     </w:p>
+    <w:p/>
+    <w:p/>
+    <w:p/>
+    <w:p/>
+    <w:p/>
+    <w:p/>
+    <w:p/>
+    <w:p>
+      <w:r>
+        <w:lastRenderedPageBreak/>
+        <w:t>Tuesday, August 11</w:t>
+      </w:r>
+    </w:p>
+    <w:p>
+      <w:r>
+        <w:t>1</w:t>
+      </w:r>
+      <w:r>
+        <w:t>:00</w:t>
+      </w:r>
+      <w:r>
+        <w:t>-</w:t>
+      </w:r>
+      <w:r>
+        <w:t>4:00pm</w:t>
+      </w:r>
+    </w:p>
+    <w:p>
+      <w:r>
+        <w:t xml:space="preserve">Essentially seeing if I </w:t>
+      </w:r>
+      <w:r>
+        <w:t>can have</w:t>
+      </w:r>
+      <w:r>
+        <w:t xml:space="preserve"> the AI augmented </w:t>
+      </w:r>
+      <w:r>
+        <w:t>incident response</w:t>
+      </w:r>
+      <w:r>
+        <w:t xml:space="preserve"> investigation </w:t>
+      </w:r>
+      <w:r>
+        <w:t>manager “</w:t>
+      </w:r>
+      <w:proofErr w:type="spellStart"/>
+      <w:proofErr w:type="gramStart"/>
+      <w:r>
+        <w:t>V</w:t>
+      </w:r>
+      <w:r>
+        <w:t>alhuntir</w:t>
+      </w:r>
+      <w:proofErr w:type="spellEnd"/>
+      <w:r>
+        <w:t xml:space="preserve">“ </w:t>
+      </w:r>
+      <w:r>
+        <w:t>running</w:t>
+      </w:r>
+      <w:proofErr w:type="gramEnd"/>
+      <w:r>
+        <w:t xml:space="preserve"> in a</w:t>
+      </w:r>
+      <w:r>
+        <w:t xml:space="preserve"> capacity that functions within our testing environment (kali) and with the types of datasets that work with our traditional tools.</w:t>
+      </w:r>
+    </w:p>
+    <w:p>
+      <w:proofErr w:type="spellStart"/>
+      <w:r>
+        <w:t>Valhuntir</w:t>
+      </w:r>
+      <w:proofErr w:type="spellEnd"/>
+      <w:r>
+        <w:t xml:space="preserve"> should work with </w:t>
+      </w:r>
+      <w:proofErr w:type="spellStart"/>
+      <w:r>
+        <w:t>lmstudio</w:t>
+      </w:r>
+      <w:proofErr w:type="spellEnd"/>
+      <w:r>
+        <w:t xml:space="preserve"> as it is considered a Model Context Protocol (MCP)</w:t>
+      </w:r>
+    </w:p>
+    <w:p>
+      <w:r>
+        <w:rPr>
+          <w:noProof/>
+        </w:rPr>
+        <w:drawing>
+          <wp:inline distT="0" distB="0" distL="0" distR="0" wp14:anchorId="4F00194D" wp14:editId="1C36B465">
+            <wp:extent cx="5729605" cy="2510790"/>
+            <wp:effectExtent l="0" t="0" r="4445" b="3810"/>
+            <wp:docPr id="1656716987" name="Picture 1"/>
+            <wp:cNvGraphicFramePr>
+              <a:graphicFrameLocks xmlns:a="http://schemas.openxmlformats.org/drawingml/2006/main" noChangeAspect="1"/>
+            </wp:cNvGraphicFramePr>
+            <a:graphic xmlns:a="http://schemas.openxmlformats.org/drawingml/2006/main">
+              <a:graphicData uri="http://schemas.openxmlformats.org/drawingml/2006/picture">
+                <pic:pic xmlns:pic="http://schemas.openxmlformats.org/drawingml/2006/picture">
+                  <pic:nvPicPr>
+                    <pic:cNvPr id="1656716987" name=""/>
+                    <pic:cNvPicPr/>
+                  </pic:nvPicPr>
+                  <pic:blipFill>
+                    <a:blip r:embed="rId11"/>
+                    <a:stretch>
+                      <a:fillRect/>
+                    </a:stretch>
+                  </pic:blipFill>
+                  <pic:spPr>
+                    <a:xfrm>
+                      <a:off x="0" y="0"/>
+                      <a:ext cx="5729605" cy="2510790"/>
+                    </a:xfrm>
+                    <a:prstGeom prst="rect">
+                      <a:avLst/>
+                    </a:prstGeom>
+                  </pic:spPr>
+                </pic:pic>
+              </a:graphicData>
+            </a:graphic>
+          </wp:inline>
+        </w:drawing>
+      </w:r>
+    </w:p>
+    <w:p>
+      <w:r>
+        <w:t xml:space="preserve">Underwent some troubleshooting due to having to increase storage space with </w:t>
+      </w:r>
+      <w:proofErr w:type="spellStart"/>
+      <w:r>
+        <w:t>gparted</w:t>
+      </w:r>
+      <w:proofErr w:type="spellEnd"/>
+      <w:r>
+        <w:t xml:space="preserve"> for </w:t>
+      </w:r>
+      <w:proofErr w:type="spellStart"/>
+      <w:r>
+        <w:t>lmstudio</w:t>
+      </w:r>
+      <w:proofErr w:type="spellEnd"/>
+      <w:r>
+        <w:t xml:space="preserve"> on account of </w:t>
+      </w:r>
+      <w:r>
+        <w:t xml:space="preserve">the lowest footprint version of </w:t>
+      </w:r>
+      <w:proofErr w:type="spellStart"/>
+      <w:r>
+        <w:t>Valhuntir</w:t>
+      </w:r>
+      <w:proofErr w:type="spellEnd"/>
+      <w:r>
+        <w:t xml:space="preserve"> being 30gb</w:t>
+      </w:r>
+    </w:p>
+    <w:p>
+      <w:r>
+        <w:drawing>
+          <wp:inline distT="0" distB="0" distL="0" distR="0" wp14:anchorId="2825F3E2" wp14:editId="4BC19DA9">
+            <wp:extent cx="3867150" cy="3302699"/>
+            <wp:effectExtent l="0" t="0" r="0" b="0"/>
+            <wp:docPr id="1887420708" name="Picture 1"/>
+            <wp:cNvGraphicFramePr>
+              <a:graphicFrameLocks xmlns:a="http://schemas.openxmlformats.org/drawingml/2006/main" noChangeAspect="1"/>
+            </wp:cNvGraphicFramePr>
+            <a:graphic xmlns:a="http://schemas.openxmlformats.org/drawingml/2006/main">
+              <a:graphicData uri="http://schemas.openxmlformats.org/drawingml/2006/picture">
+                <pic:pic xmlns:pic="http://schemas.openxmlformats.org/drawingml/2006/picture">
+                  <pic:nvPicPr>
+                    <pic:cNvPr id="1887420708" name=""/>
+                    <pic:cNvPicPr/>
+                  </pic:nvPicPr>
+                  <pic:blipFill>
+                    <a:blip r:embed="rId12"/>
+                    <a:stretch>
+                      <a:fillRect/>
+                    </a:stretch>
+                  </pic:blipFill>
+                  <pic:spPr>
+                    <a:xfrm>
+                      <a:off x="0" y="0"/>
+                      <a:ext cx="3878651" cy="3312521"/>
+                    </a:xfrm>
+                    <a:prstGeom prst="rect">
+                      <a:avLst/>
+                    </a:prstGeom>
+                  </pic:spPr>
+                </pic:pic>
+              </a:graphicData>
+            </a:graphic>
+          </wp:inline>
+        </w:drawing>
+      </w:r>
+    </w:p>
+    <w:p/>
+    <w:p>
+      <w:pPr>
+        <w:pStyle w:val="Heading2"/>
+      </w:pPr>
+      <w:bookmarkStart w:id="7" w:name="_Toc237345722"/>
+      <w:r>
+        <w:t>Development</w:t>
+      </w:r>
+      <w:bookmarkEnd w:id="7"/>
+    </w:p>
     <w:sectPr>
-      <w:headerReference w:type="default" r:id="rId11"/>
-      <w:footerReference w:type="even" r:id="rId12"/>
-      <w:footerReference w:type="default" r:id="rId13"/>
-      <w:footerReference w:type="first" r:id="rId14"/>
+      <w:headerReference w:type="default" r:id="rId13"/>
+      <w:footerReference w:type="even" r:id="rId14"/>
+      <w:footerReference w:type="default" r:id="rId15"/>
+      <w:footerReference w:type="first" r:id="rId16"/>
       <w:pgSz w:w="11906" w:h="16838"/>
       <w:pgMar w:top="1483" w:right="1448" w:bottom="1544" w:left="1435" w:header="720" w:footer="730" w:gutter="0"/>
       <w:pgNumType w:start="0"/>

</xml_diff>

<commit_message>
added week 4 team meeting minutes, updated matt week 5 log
</commit_message>
<xml_diff>
--- a/Weekly Logs/Matt/Matt Baker - Week 5 Individual Logbook.docx
+++ b/Weekly Logs/Matt/Matt Baker - Week 5 Individual Logbook.docx
@@ -2845,6 +2845,9 @@
       <w:r>
         <w:t xml:space="preserve"> as it is considered a Model Context Protocol (MCP)</w:t>
       </w:r>
+      <w:r>
+        <w:t xml:space="preserve"> client</w:t>
+      </w:r>
     </w:p>
     <w:p>
       <w:r>
@@ -2922,6 +2925,9 @@
     </w:p>
     <w:p>
       <w:r>
+        <w:rPr>
+          <w:noProof/>
+        </w:rPr>
         <w:drawing>
           <wp:inline distT="0" distB="0" distL="0" distR="0" wp14:anchorId="2825F3E2" wp14:editId="4BC19DA9">
             <wp:extent cx="3867150" cy="3302699"/>
@@ -2960,6 +2966,53 @@
       </w:r>
     </w:p>
     <w:p/>
+    <w:p/>
+    <w:p/>
+    <w:p>
+      <w:r>
+        <w:lastRenderedPageBreak/>
+        <w:t>5:00PM-6:00PM</w:t>
+      </w:r>
+    </w:p>
+    <w:p>
+      <w:r>
+        <w:drawing>
+          <wp:inline distT="0" distB="0" distL="0" distR="0" wp14:anchorId="2D478045" wp14:editId="6DDE1512">
+            <wp:extent cx="4826416" cy="3800475"/>
+            <wp:effectExtent l="0" t="0" r="0" b="0"/>
+            <wp:docPr id="349587033" name="Picture 1"/>
+            <wp:cNvGraphicFramePr>
+              <a:graphicFrameLocks xmlns:a="http://schemas.openxmlformats.org/drawingml/2006/main" noChangeAspect="1"/>
+            </wp:cNvGraphicFramePr>
+            <a:graphic xmlns:a="http://schemas.openxmlformats.org/drawingml/2006/main">
+              <a:graphicData uri="http://schemas.openxmlformats.org/drawingml/2006/picture">
+                <pic:pic xmlns:pic="http://schemas.openxmlformats.org/drawingml/2006/picture">
+                  <pic:nvPicPr>
+                    <pic:cNvPr id="349587033" name=""/>
+                    <pic:cNvPicPr/>
+                  </pic:nvPicPr>
+                  <pic:blipFill>
+                    <a:blip r:embed="rId13"/>
+                    <a:stretch>
+                      <a:fillRect/>
+                    </a:stretch>
+                  </pic:blipFill>
+                  <pic:spPr>
+                    <a:xfrm>
+                      <a:off x="0" y="0"/>
+                      <a:ext cx="4830762" cy="3803897"/>
+                    </a:xfrm>
+                    <a:prstGeom prst="rect">
+                      <a:avLst/>
+                    </a:prstGeom>
+                  </pic:spPr>
+                </pic:pic>
+              </a:graphicData>
+            </a:graphic>
+          </wp:inline>
+        </w:drawing>
+      </w:r>
+    </w:p>
     <w:p>
       <w:pPr>
         <w:pStyle w:val="Heading2"/>
@@ -2971,10 +3024,10 @@
       <w:bookmarkEnd w:id="7"/>
     </w:p>
     <w:sectPr>
-      <w:headerReference w:type="default" r:id="rId13"/>
-      <w:footerReference w:type="even" r:id="rId14"/>
-      <w:footerReference w:type="default" r:id="rId15"/>
-      <w:footerReference w:type="first" r:id="rId16"/>
+      <w:headerReference w:type="default" r:id="rId14"/>
+      <w:footerReference w:type="even" r:id="rId15"/>
+      <w:footerReference w:type="default" r:id="rId16"/>
+      <w:footerReference w:type="first" r:id="rId17"/>
       <w:pgSz w:w="11906" w:h="16838"/>
       <w:pgMar w:top="1483" w:right="1448" w:bottom="1544" w:left="1435" w:header="720" w:footer="730" w:gutter="0"/>
       <w:pgNumType w:start="0"/>

</xml_diff>